<commit_message>
Add the portfolio link to the resume contact line
</commit_message>
<xml_diff>
--- a/Tanish_Raj_Sharma_Resume.docx
+++ b/Tanish_Raj_Sharma_Resume.docx
@@ -52,6 +52,27 @@
         <w:spacing w:after="100"/>
         <w:jc w:val="center"/>
       </w:pPr>
+      <w:hyperlink w:history="1" r:id="rIdPortfolioLink01">
+        <w:r>
+          <w:rPr>
+            <w:rFonts w:ascii="Calibri" w:cs="Calibri" w:eastAsia="Calibri" w:hAnsi="Calibri"/>
+            <w:color w:val="1A56DB"/>
+            <w:sz w:val="19"/>
+            <w:szCs w:val="19"/>
+            <w:u w:val="single"/>
+          </w:rPr>
+          <w:t xml:space="preserve">portfolio.tanishrajsharma151.workers.dev</w:t>
+        </w:r>
+      </w:hyperlink>
+      <w:r>
+        <w:rPr>
+          <w:rFonts w:ascii="Calibri" w:cs="Calibri" w:eastAsia="Calibri" w:hAnsi="Calibri"/>
+          <w:color w:val="555555"/>
+          <w:sz w:val="18"/>
+          <w:szCs w:val="18"/>
+        </w:rPr>
+        <w:t xml:space="preserve">   •   </w:t>
+      </w:r>
       <w:hyperlink w:history="1" r:id="rIdcv8ww2wm1xdkoewvoaidg">
         <w:r>
           <w:rPr>

</xml_diff>